<commit_message>
Add HGF three-layer visualizer and update presentation files
Co-Authored-By: Claude Opus 4.8 <noreply@anthropic.com>
</commit_message>
<xml_diff>
--- a/presentation/summaries.docx
+++ b/presentation/summaries.docx
@@ -1,6 +1,6 @@
 
 <file path=word/document.xml><?xml version="1.0" encoding="utf-8"?>
-<w:document xmlns:wpc="http://schemas.microsoft.com/office/word/2010/wordprocessingCanvas" xmlns:cx="http://schemas.microsoft.com/office/drawing/2014/chartex" xmlns:cx1="http://schemas.microsoft.com/office/drawing/2015/9/8/chartex" xmlns:mc="http://schemas.openxmlformats.org/markup-compatibility/2006" xmlns:o="urn:schemas-microsoft-com:office:office" xmlns:r="http://schemas.openxmlformats.org/officeDocument/2006/relationships" xmlns:m="http://schemas.openxmlformats.org/officeDocument/2006/math" xmlns:v="urn:schemas-microsoft-com:vml" xmlns:wp14="http://schemas.microsoft.com/office/word/2010/wordprocessingDrawing" xmlns:wp="http://schemas.openxmlformats.org/drawingml/2006/wordprocessingDrawing" xmlns:w10="urn:schemas-microsoft-com:office:word" xmlns:w="http://schemas.openxmlformats.org/wordprocessingml/2006/main" xmlns:w14="http://schemas.microsoft.com/office/word/2010/wordml" xmlns:w15="http://schemas.microsoft.com/office/word/2012/wordml" xmlns:w16se="http://schemas.microsoft.com/office/word/2015/wordml/symex" xmlns:wpg="http://schemas.microsoft.com/office/word/2010/wordprocessingGroup" xmlns:wpi="http://schemas.microsoft.com/office/word/2010/wordprocessingInk" xmlns:wne="http://schemas.microsoft.com/office/word/2006/wordml" xmlns:wps="http://schemas.microsoft.com/office/word/2010/wordprocessingShape" mc:Ignorable="w14 w15 w16se wp14">
+<w:document xmlns:wpc="http://schemas.microsoft.com/office/word/2010/wordprocessingCanvas" xmlns:cx="http://schemas.microsoft.com/office/drawing/2014/chartex" xmlns:cx1="http://schemas.microsoft.com/office/drawing/2015/9/8/chartex" xmlns:cx2="http://schemas.microsoft.com/office/drawing/2015/10/21/chartex" xmlns:cx3="http://schemas.microsoft.com/office/drawing/2016/5/9/chartex" xmlns:cx4="http://schemas.microsoft.com/office/drawing/2016/5/10/chartex" xmlns:cx5="http://schemas.microsoft.com/office/drawing/2016/5/11/chartex" xmlns:cx6="http://schemas.microsoft.com/office/drawing/2016/5/12/chartex" xmlns:cx7="http://schemas.microsoft.com/office/drawing/2016/5/13/chartex" xmlns:cx8="http://schemas.microsoft.com/office/drawing/2016/5/14/chartex" xmlns:mc="http://schemas.openxmlformats.org/markup-compatibility/2006" xmlns:aink="http://schemas.microsoft.com/office/drawing/2016/ink" xmlns:am3d="http://schemas.microsoft.com/office/drawing/2017/model3d" xmlns:o="urn:schemas-microsoft-com:office:office" xmlns:oel="http://schemas.microsoft.com/office/2019/extlst" xmlns:r="http://schemas.openxmlformats.org/officeDocument/2006/relationships" xmlns:m="http://schemas.openxmlformats.org/officeDocument/2006/math" xmlns:v="urn:schemas-microsoft-com:vml" xmlns:wp14="http://schemas.microsoft.com/office/word/2010/wordprocessingDrawing" xmlns:wp="http://schemas.openxmlformats.org/drawingml/2006/wordprocessingDrawing" xmlns:w10="urn:schemas-microsoft-com:office:word" xmlns:w="http://schemas.openxmlformats.org/wordprocessingml/2006/main" xmlns:w14="http://schemas.microsoft.com/office/word/2010/wordml" xmlns:w15="http://schemas.microsoft.com/office/word/2012/wordml" xmlns:w16cex="http://schemas.microsoft.com/office/word/2018/wordml/cex" xmlns:w16cid="http://schemas.microsoft.com/office/word/2016/wordml/cid" xmlns:w16="http://schemas.microsoft.com/office/word/2018/wordml" xmlns:w16du="http://schemas.microsoft.com/office/word/2023/wordml/word16du" xmlns:w16sdtdh="http://schemas.microsoft.com/office/word/2020/wordml/sdtdatahash" xmlns:w16sdtfl="http://schemas.microsoft.com/office/word/2024/wordml/sdtformatlock" xmlns:w16se="http://schemas.microsoft.com/office/word/2015/wordml/symex" xmlns:wpg="http://schemas.microsoft.com/office/word/2010/wordprocessingGroup" xmlns:wpi="http://schemas.microsoft.com/office/word/2010/wordprocessingInk" xmlns:wne="http://schemas.microsoft.com/office/word/2006/wordml" xmlns:wps="http://schemas.microsoft.com/office/word/2010/wordprocessingShape" mc:Ignorable="w14 w15 w16se w16cid w16 w16cex w16sdtdh w16sdtfl w16du wp14">
   <w:body>
     <w:p>
       <w:r>
@@ -9,18 +9,18 @@
     </w:p>
     <w:p>
       <w:r>
-        <w:t>Get the cumulative sum of spikes after an event in a certain window (</w:t>
-      </w:r>
-      <w:proofErr w:type="spellStart"/>
-      <w:r>
-        <w:t>e.g</w:t>
-      </w:r>
-      <w:proofErr w:type="spellEnd"/>
-      <w:r>
-        <w:t xml:space="preserve"> 2 seconds) and at plot. Measure the difference between cumulative sum and </w:t>
-      </w:r>
-      <w:r>
-        <w:t xml:space="preserve">average background firing (what is background?). </w:t>
+        <w:t xml:space="preserve">Get the cumulative sum of spikes after an event in a certain window (e.g 2 seconds) and plot. Measure the difference between cumulative sum and </w:t>
+      </w:r>
+      <w:r>
+        <w:t>average background firing</w:t>
+      </w:r>
+      <w:r>
+        <w:t xml:space="preserve"> </w:t>
+      </w:r>
+    </w:p>
+    <w:p>
+      <w:r>
+        <w:t>Sum up all spikes within selected time window</w:t>
       </w:r>
     </w:p>
     <w:p/>
@@ -40,20 +40,10 @@
       <w:r>
         <w:t>Zeta 2 reward</w:t>
       </w:r>
-      <w:bookmarkStart w:id="0" w:name="_GoBack"/>
-      <w:bookmarkEnd w:id="0"/>
-    </w:p>
-    <w:p>
-      <w:r>
-        <w:t xml:space="preserve">Difference between zeta </w:t>
-      </w:r>
-      <w:proofErr w:type="gramStart"/>
-      <w:r>
-        <w:t>magnitude</w:t>
-      </w:r>
-      <w:proofErr w:type="gramEnd"/>
-      <w:r>
-        <w:t xml:space="preserve"> between different outcomes</w:t>
+    </w:p>
+    <w:p>
+      <w:r>
+        <w:t>Difference between zeta magnitude between different outcomes</w:t>
       </w:r>
     </w:p>
     <w:p>
@@ -92,28 +82,12 @@
         <w:t xml:space="preserve"> Behavioural Model</w:t>
       </w:r>
       <w:r>
-        <w:t xml:space="preserve">ling with three or more layers. Other than </w:t>
-      </w:r>
-      <w:proofErr w:type="spellStart"/>
-      <w:r>
-        <w:t>Rescorla</w:t>
-      </w:r>
-      <w:proofErr w:type="spellEnd"/>
-      <w:r>
-        <w:t xml:space="preserve"> Wagner Q Learning, HGF is also able to estimate a “volatility” = how quickly do probabilities change. At its core, it is however similar to RW, with the belief being updated with each prediction error. </w:t>
-      </w:r>
-    </w:p>
-    <w:p>
-      <w:r>
-        <w:t>(</w:t>
-      </w:r>
-      <w:proofErr w:type="gramStart"/>
-      <w:r>
-        <w:t>delta)</w:t>
-      </w:r>
-      <w:proofErr w:type="gramEnd"/>
-      <w:r>
-        <w:t>1 equation</w:t>
+        <w:t xml:space="preserve">ling with three or more layers. Other than Rescorla Wagner Q Learning, HGF is also able to estimate a “volatility” = how quickly do probabilities change. At its core, it is however similar to RW, with the belief being updated with each prediction error. </w:t>
+      </w:r>
+    </w:p>
+    <w:p>
+      <w:r>
+        <w:t>(delta)1 equation</w:t>
       </w:r>
     </w:p>
     <w:p>
@@ -123,15 +97,7 @@
     </w:p>
     <w:p>
       <w:r>
-        <w:t>(</w:t>
-      </w:r>
-      <w:proofErr w:type="gramStart"/>
-      <w:r>
-        <w:t>sigma</w:t>
-      </w:r>
-      <w:proofErr w:type="gramEnd"/>
-      <w:r>
-        <w:t xml:space="preserve"> hat)2 equation</w:t>
+        <w:t>(sigma hat)2 equation</w:t>
       </w:r>
     </w:p>
     <w:p/>
@@ -144,48 +110,18 @@
     </w:p>
     <w:p>
       <w:r>
-        <w:t>(µ-hat</w:t>
-      </w:r>
-      <w:proofErr w:type="gramStart"/>
-      <w:r>
-        <w:t>)2</w:t>
-      </w:r>
-      <w:proofErr w:type="gramEnd"/>
-      <w:r>
-        <w:t>: belief about tendency to get reward – can have any value</w:t>
-      </w:r>
-    </w:p>
-    <w:p>
-      <w:r>
-        <w:t>(µ-hat</w:t>
-      </w:r>
-      <w:proofErr w:type="gramStart"/>
-      <w:r>
-        <w:t>)</w:t>
-      </w:r>
-      <w:r>
-        <w:t>1</w:t>
-      </w:r>
-      <w:proofErr w:type="gramEnd"/>
-      <w:r>
-        <w:t>:</w:t>
+        <w:t>(µ-hat)2: belief about tendency to get reward – can have any value</w:t>
+      </w:r>
+    </w:p>
+    <w:p>
+      <w:r>
+        <w:t>(µ-hat)1:</w:t>
       </w:r>
       <w:r>
         <w:t xml:space="preserve"> what is used to determine action.</w:t>
       </w:r>
       <w:r>
-        <w:t xml:space="preserve"> </w:t>
-      </w:r>
-      <w:proofErr w:type="gramStart"/>
-      <w:r>
-        <w:t>sigmoid</w:t>
-      </w:r>
-      <w:proofErr w:type="gramEnd"/>
-      <w:r>
-        <w:t xml:space="preserve"> transformed </w:t>
-      </w:r>
-      <w:r>
-        <w:t>(µ-hat)</w:t>
+        <w:t xml:space="preserve"> sigmoid transformed (µ-hat)</w:t>
       </w:r>
       <w:r>
         <w:t>2: value is between 0 and 1</w:t>
@@ -193,49 +129,20 @@
     </w:p>
     <w:p>
       <w:r>
-        <w:t>(</w:t>
-      </w:r>
-      <w:proofErr w:type="gramStart"/>
-      <w:r>
-        <w:t>delta)</w:t>
-      </w:r>
-      <w:proofErr w:type="gramEnd"/>
-      <w:r>
-        <w:t>1: prediction error on the lowest level. Always negative when no reward was received and vice versa</w:t>
-      </w:r>
-    </w:p>
-    <w:p>
-      <w:r>
-        <w:t>(</w:t>
-      </w:r>
-      <w:proofErr w:type="gramStart"/>
-      <w:r>
-        <w:t>sigma</w:t>
-      </w:r>
-      <w:proofErr w:type="gramEnd"/>
-      <w:r>
-        <w:t xml:space="preserve"> hat)2: uncertainty. Is only updated via volatility belief</w:t>
-      </w:r>
-    </w:p>
-    <w:p>
-      <w:r>
-        <w:t>(</w:t>
-      </w:r>
-      <w:proofErr w:type="gramStart"/>
-      <w:r>
-        <w:t>pi)</w:t>
-      </w:r>
-      <w:proofErr w:type="gramEnd"/>
-      <w:r>
-        <w:t xml:space="preserve">2: precision: is derived from (sigma hat)2 and (µ-hat)1. Is highest when uncertainty is low and </w:t>
-      </w:r>
-      <w:proofErr w:type="spellStart"/>
-      <w:r>
-        <w:t>and</w:t>
-      </w:r>
-      <w:proofErr w:type="spellEnd"/>
-      <w:r>
-        <w:t xml:space="preserve"> the belief</w:t>
+        <w:t>(delta)1: prediction error on the lowest level. Always negative when no reward was received and vice versa</w:t>
+      </w:r>
+    </w:p>
+    <w:p>
+      <w:r>
+        <w:t>(sigma hat)2: uncertainty. Is only updated via volatility belief</w:t>
+      </w:r>
+    </w:p>
+    <w:p>
+      <w:r>
+        <w:t xml:space="preserve">(pi)2: precision: is derived from (sigma hat)2 and (µ-hat)1. Is highest when uncertainty is low and </w:t>
+      </w:r>
+      <w:r>
+        <w:t>and the belief</w:t>
       </w:r>
       <w:r>
         <w:t xml:space="preserve"> is 0.5. </w:t>
@@ -243,15 +150,8 @@
     </w:p>
     <w:p>
       <w:r>
-        <w:t>(</w:t>
-      </w:r>
-      <w:proofErr w:type="gramStart"/>
-      <w:r>
-        <w:t>delta)</w:t>
-      </w:r>
-      <w:proofErr w:type="gramEnd"/>
-      <w:r>
-        <w:t xml:space="preserve">2: prediction error on volatility level. Is highest when the belief moved more than expected and it is negative when it moved less than expected. </w:t>
+        <w:lastRenderedPageBreak/>
+        <w:t xml:space="preserve">(delta)2: prediction error on volatility level. Is highest when the belief moved more than expected and it is negative when it moved less than expected. </w:t>
       </w:r>
     </w:p>
     <w:sectPr>
@@ -265,7 +165,7 @@
 </file>
 
 <file path=word/styles.xml><?xml version="1.0" encoding="utf-8"?>
-<w:styles xmlns:mc="http://schemas.openxmlformats.org/markup-compatibility/2006" xmlns:r="http://schemas.openxmlformats.org/officeDocument/2006/relationships" xmlns:w="http://schemas.openxmlformats.org/wordprocessingml/2006/main" xmlns:w14="http://schemas.microsoft.com/office/word/2010/wordml" xmlns:w15="http://schemas.microsoft.com/office/word/2012/wordml" xmlns:w16se="http://schemas.microsoft.com/office/word/2015/wordml/symex" mc:Ignorable="w14 w15 w16se">
+<w:styles xmlns:mc="http://schemas.openxmlformats.org/markup-compatibility/2006" xmlns:r="http://schemas.openxmlformats.org/officeDocument/2006/relationships" xmlns:w="http://schemas.openxmlformats.org/wordprocessingml/2006/main" xmlns:w14="http://schemas.microsoft.com/office/word/2010/wordml" xmlns:w15="http://schemas.microsoft.com/office/word/2012/wordml" xmlns:w16cex="http://schemas.microsoft.com/office/word/2018/wordml/cex" xmlns:w16cid="http://schemas.microsoft.com/office/word/2016/wordml/cid" xmlns:w16="http://schemas.microsoft.com/office/word/2018/wordml" xmlns:w16du="http://schemas.microsoft.com/office/word/2023/wordml/word16du" xmlns:w16sdtdh="http://schemas.microsoft.com/office/word/2020/wordml/sdtdatahash" xmlns:w16sdtfl="http://schemas.microsoft.com/office/word/2024/wordml/sdtformatlock" xmlns:w16se="http://schemas.microsoft.com/office/word/2015/wordml/symex" mc:Ignorable="w14 w15 w16se w16cid w16 w16cex w16sdtdh w16sdtfl w16du">
   <w:docDefaults>
     <w:rPrDefault>
       <w:rPr>
@@ -281,7 +181,7 @@
       </w:pPr>
     </w:pPrDefault>
   </w:docDefaults>
-  <w:latentStyles w:defLockedState="0" w:defUIPriority="99" w:defSemiHidden="0" w:defUnhideWhenUsed="0" w:defQFormat="0" w:count="371">
+  <w:latentStyles w:defLockedState="0" w:defUIPriority="99" w:defSemiHidden="0" w:defUnhideWhenUsed="0" w:defQFormat="0" w:count="376">
     <w:lsdException w:name="Normal" w:uiPriority="0" w:qFormat="1"/>
     <w:lsdException w:name="heading 1" w:uiPriority="9" w:qFormat="1"/>
     <w:lsdException w:name="heading 2" w:semiHidden="1" w:uiPriority="9" w:unhideWhenUsed="1" w:qFormat="1"/>
@@ -653,17 +553,23 @@
     <w:lsdException w:name="List Table 5 Dark Accent 6" w:uiPriority="50"/>
     <w:lsdException w:name="List Table 6 Colorful Accent 6" w:uiPriority="51"/>
     <w:lsdException w:name="List Table 7 Colorful Accent 6" w:uiPriority="52"/>
+    <w:lsdException w:name="Mention" w:semiHidden="1" w:unhideWhenUsed="1"/>
+    <w:lsdException w:name="Smart Hyperlink" w:semiHidden="1" w:unhideWhenUsed="1"/>
+    <w:lsdException w:name="Hashtag" w:semiHidden="1" w:unhideWhenUsed="1"/>
+    <w:lsdException w:name="Unresolved Mention" w:semiHidden="1" w:unhideWhenUsed="1"/>
+    <w:lsdException w:name="Smart Link" w:semiHidden="1" w:unhideWhenUsed="1"/>
   </w:latentStyles>
-  <w:style w:type="paragraph" w:default="1" w:styleId="Normal">
+  <w:style w:type="paragraph" w:default="1" w:styleId="Standard">
     <w:name w:val="Normal"/>
     <w:qFormat/>
   </w:style>
-  <w:style w:type="character" w:default="1" w:styleId="DefaultParagraphFont">
+  <w:style w:type="character" w:default="1" w:styleId="Absatz-Standardschriftart">
     <w:name w:val="Default Paragraph Font"/>
     <w:uiPriority w:val="1"/>
+    <w:semiHidden/>
     <w:unhideWhenUsed/>
   </w:style>
-  <w:style w:type="table" w:default="1" w:styleId="TableNormal">
+  <w:style w:type="table" w:default="1" w:styleId="NormaleTabelle">
     <w:name w:val="Normal Table"/>
     <w:uiPriority w:val="99"/>
     <w:semiHidden/>
@@ -678,7 +584,7 @@
       </w:tblCellMar>
     </w:tblPr>
   </w:style>
-  <w:style w:type="numbering" w:default="1" w:styleId="NoList">
+  <w:style w:type="numbering" w:default="1" w:styleId="KeineListe">
     <w:name w:val="No List"/>
     <w:uiPriority w:val="99"/>
     <w:semiHidden/>

</xml_diff>